<commit_message>
Rehacer el formato de los siete documentos para que se puedan entregar.
Encabezados, filas alternadas y un dashboard con tarjetas y gráficas. El registro de ventas vuelve a incluir las filas que sí se leen en la foto.

Co-authored-by: sebsotoosolis-ui <sebsotoosolis-ui@users.noreply.github.com>
</commit_message>
<xml_diff>
--- a/documentos/Actividades de ocio y recreacion.docx
+++ b/documentos/Actividades de ocio y recreacion.docx
@@ -2,71 +2,148 @@
 <file path=word/document.xml><?xml version="1.0" encoding="utf-8"?>
 <w:document xmlns:wpc="http://schemas.microsoft.com/office/word/2010/wordprocessingCanvas" xmlns:mo="http://schemas.microsoft.com/office/mac/office/2008/main" xmlns:mc="http://schemas.openxmlformats.org/markup-compatibility/2006" xmlns:mv="urn:schemas-microsoft-com:mac:vml" xmlns:o="urn:schemas-microsoft-com:office:office" xmlns:r="http://schemas.openxmlformats.org/officeDocument/2006/relationships" xmlns:m="http://schemas.openxmlformats.org/officeDocument/2006/math" xmlns:v="urn:schemas-microsoft-com:vml" xmlns:wp14="http://schemas.microsoft.com/office/word/2010/wordprocessingDrawing" xmlns:wp="http://schemas.openxmlformats.org/drawingml/2006/wordprocessingDrawing" xmlns:w10="urn:schemas-microsoft-com:office:word" xmlns:w="http://schemas.openxmlformats.org/wordprocessingml/2006/main" xmlns:w14="http://schemas.microsoft.com/office/word/2010/wordml" xmlns:wpg="http://schemas.microsoft.com/office/word/2010/wordprocessingGroup" xmlns:wpi="http://schemas.microsoft.com/office/word/2010/wordprocessingInk" xmlns:wne="http://schemas.microsoft.com/office/word/2006/wordml" xmlns:wps="http://schemas.microsoft.com/office/word/2010/wordprocessingShape" mc:Ignorable="w14 wp14">
   <w:body>
+    <w:tbl>
+      <w:tblPr>
+        <w:tblW w:type="auto" w:w="0"/>
+        <w:tblLayout w:type="fixed"/>
+        <w:tblLook w:firstColumn="1" w:firstRow="1" w:lastColumn="0" w:lastRow="0" w:noHBand="0" w:noVBand="1" w:val="04A0"/>
+      </w:tblPr>
+      <w:tblGrid>
+        <w:gridCol w:w="10318"/>
+      </w:tblGrid>
+      <w:tr>
+        <w:tc>
+          <w:tcPr>
+            <w:tcW w:type="dxa" w:w="10312"/>
+            <w:shd w:fill="1B3A4B" w:val="clear"/>
+            <w:tcBorders>
+              <w:top w:val="nil" w:sz="0" w:color="FFFFFF"/>
+              <w:left w:val="nil" w:sz="0" w:color="FFFFFF"/>
+              <w:bottom w:val="nil" w:sz="0" w:color="FFFFFF"/>
+              <w:right w:val="nil" w:sz="0" w:color="FFFFFF"/>
+            </w:tcBorders>
+          </w:tcPr>
+          <w:p>
+            <w:pPr>
+              <w:spacing w:before="160" w:after="0" w:line="259" w:lineRule="auto"/>
+              <w:jc w:val="left"/>
+            </w:pPr>
+            <w:r/>
+            <w:r>
+              <w:rPr>
+                <w:rFonts w:ascii="Calibri" w:hAnsi="Calibri" w:eastAsia="Calibri"/>
+                <w:b/>
+                <w:i w:val="0"/>
+                <w:color w:val="E08A1E"/>
+                <w:sz w:val="22"/>
+              </w:rPr>
+              <w:t>TEMA</w:t>
+            </w:r>
+          </w:p>
+          <w:p>
+            <w:pPr>
+              <w:spacing w:before="0" w:after="40"/>
+            </w:pPr>
+            <w:r>
+              <w:rPr>
+                <w:rFonts w:ascii="Calibri" w:hAnsi="Calibri" w:eastAsia="Calibri"/>
+                <w:b/>
+                <w:i w:val="0"/>
+                <w:color w:val="FFFFFF"/>
+                <w:sz w:val="52"/>
+              </w:rPr>
+              <w:t>Actividades de ocio y recreación</w:t>
+            </w:r>
+          </w:p>
+          <w:p>
+            <w:pPr>
+              <w:spacing w:before="40" w:after="200"/>
+            </w:pPr>
+            <w:r>
+              <w:rPr>
+                <w:rFonts w:ascii="Calibri" w:hAnsi="Calibri" w:eastAsia="Calibri"/>
+                <w:b w:val="0"/>
+                <w:i/>
+                <w:color w:val="D6E2EA"/>
+                <w:sz w:val="24"/>
+              </w:rPr>
+              <w:t>Sergi, Álvaro y SebSoto</w:t>
+            </w:r>
+          </w:p>
+        </w:tc>
+      </w:tr>
+    </w:tbl>
     <w:p>
       <w:pPr>
-        <w:spacing w:before="0" w:after="200" w:line="276" w:lineRule="auto"/>
-        <w:jc w:val="left"/>
+        <w:spacing w:after="80"/>
       </w:pPr>
-      <w:r>
-        <w:rPr>
-          <w:rFonts w:ascii="Calibri" w:hAnsi="Calibri" w:eastAsia="Calibri"/>
-          <w:b w:val="0"/>
-          <w:i/>
-          <w:color w:val="5A5A5A"/>
-          <w:sz w:val="22"/>
-        </w:rPr>
-        <w:t>Grupo: Sergi, Álvaro y SebSoto</w:t>
-      </w:r>
     </w:p>
+    <w:tbl>
+      <w:tblPr>
+        <w:tblW w:type="auto" w:w="0"/>
+        <w:tblLayout w:type="fixed"/>
+        <w:tblLook w:firstColumn="1" w:firstRow="1" w:lastColumn="0" w:lastRow="0" w:noHBand="0" w:noVBand="1" w:val="04A0"/>
+      </w:tblPr>
+      <w:tblGrid>
+        <w:gridCol w:w="10318"/>
+      </w:tblGrid>
+      <w:tr>
+        <w:tc>
+          <w:tcPr>
+            <w:tcW w:type="dxa" w:w="10312"/>
+            <w:shd w:fill="F4F7FA" w:val="clear"/>
+            <w:tcBorders>
+              <w:top w:val="single" w:sz="12" w:color="1F4E79"/>
+              <w:left w:val="single" w:sz="12" w:color="1F4E79"/>
+              <w:bottom w:val="single" w:sz="12" w:color="1F4E79"/>
+              <w:right w:val="single" w:sz="12" w:color="1F4E79"/>
+            </w:tcBorders>
+          </w:tcPr>
+          <w:p>
+            <w:pPr>
+              <w:spacing w:before="160" w:after="160" w:line="259" w:lineRule="auto"/>
+              <w:jc w:val="left"/>
+            </w:pPr>
+            <w:r/>
+            <w:r>
+              <w:rPr>
+                <w:rFonts w:ascii="Calibri" w:hAnsi="Calibri" w:eastAsia="Calibri"/>
+                <w:b w:val="0"/>
+                <w:i w:val="0"/>
+                <w:color w:val="1B3A4B"/>
+                <w:sz w:val="28"/>
+              </w:rPr>
+              <w:t>¿Las plataformas de ocio y dopamina rápida, nos alejan de nosotros mismos y de lo que podemos llegar a ser?</w:t>
+            </w:r>
+          </w:p>
+        </w:tc>
+      </w:tr>
+    </w:tbl>
     <w:p>
       <w:pPr>
-        <w:spacing w:before="0" w:after="280" w:line="276" w:lineRule="auto"/>
-        <w:jc w:val="left"/>
+        <w:spacing w:before="160" w:after="40"/>
       </w:pPr>
       <w:r>
         <w:rPr>
           <w:rFonts w:ascii="Calibri" w:hAnsi="Calibri" w:eastAsia="Calibri"/>
           <w:b/>
           <w:i w:val="0"/>
-          <w:color w:val="1F4E79"/>
-          <w:sz w:val="44"/>
+          <w:color w:val="E08A1E"/>
+          <w:sz w:val="22"/>
         </w:rPr>
-        <w:t>Tema: Actividades de ocio y recreación</w:t>
+        <w:t>Fuente posible</w:t>
       </w:r>
     </w:p>
     <w:p>
       <w:pPr>
-        <w:spacing w:before="80" w:after="240" w:line="276" w:lineRule="auto"/>
-        <w:jc w:val="left"/>
+        <w:spacing w:before="0" w:after="200"/>
       </w:pPr>
       <w:r>
         <w:rPr>
           <w:rFonts w:ascii="Calibri" w:hAnsi="Calibri" w:eastAsia="Calibri"/>
           <w:b w:val="0"/>
           <w:i w:val="0"/>
-          <w:sz w:val="28"/>
-        </w:rPr>
-        <w:t>¿Las plataformas de ocio y dopamina rápida, nos alejan de nosotros mismos y de lo que podemos llegar a ser?</w:t>
-      </w:r>
-    </w:p>
-    <w:p>
-      <w:pPr>
-        <w:spacing w:before="80" w:after="240"/>
-      </w:pPr>
-      <w:r>
-        <w:rPr>
-          <w:rFonts w:ascii="Calibri" w:hAnsi="Calibri" w:eastAsia="Calibri"/>
-          <w:b/>
-          <w:i w:val="0"/>
-          <w:sz w:val="24"/>
-        </w:rPr>
-        <w:t xml:space="preserve">Fuente posible: </w:t>
-      </w:r>
-      <w:r>
-        <w:rPr>
-          <w:rFonts w:ascii="Calibri" w:hAnsi="Calibri" w:eastAsia="Calibri"/>
-          <w:b w:val="0"/>
-          <w:i w:val="0"/>
+          <w:color w:val="1F2933"/>
           <w:sz w:val="24"/>
         </w:rPr>
         <w:t>Artículos de otras investigaciones.</w:t>
@@ -74,144 +151,467 @@
     </w:p>
     <w:p>
       <w:pPr>
-        <w:spacing w:before="160" w:after="120" w:line="276" w:lineRule="auto"/>
-        <w:jc w:val="left"/>
+        <w:spacing w:before="120" w:after="160"/>
       </w:pPr>
       <w:r>
         <w:rPr>
           <w:rFonts w:ascii="Calibri" w:hAnsi="Calibri" w:eastAsia="Calibri"/>
           <w:b/>
           <w:i w:val="0"/>
-          <w:color w:val="1F4E79"/>
-          <w:sz w:val="26"/>
+          <w:color w:val="1B3A4B"/>
+          <w:sz w:val="32"/>
         </w:rPr>
-        <w:t>Variables que necesitaría:</w:t>
+        <w:t>Variables que necesitaría</w:t>
       </w:r>
     </w:p>
+    <w:tbl>
+      <w:tblPr>
+        <w:tblW w:type="auto" w:w="0"/>
+        <w:tblLayout w:type="fixed"/>
+        <w:tblLook w:firstColumn="1" w:firstRow="1" w:lastColumn="0" w:lastRow="0" w:noHBand="0" w:noVBand="1" w:val="04A0"/>
+      </w:tblPr>
+      <w:tblGrid>
+        <w:gridCol w:w="737"/>
+        <w:gridCol w:w="9581"/>
+      </w:tblGrid>
+      <w:tr>
+        <w:trPr>
+          <w:cantSplit/>
+        </w:trPr>
+        <w:tc>
+          <w:tcPr>
+            <w:tcW w:type="dxa" w:w="5156"/>
+            <w:shd w:fill="1F4E79" w:val="clear"/>
+            <w:tcBorders>
+              <w:top w:val="single" w:sz="4" w:color="FFFFFF"/>
+              <w:left w:val="single" w:sz="4" w:color="FFFFFF"/>
+              <w:bottom w:val="single" w:sz="4" w:color="FFFFFF"/>
+              <w:right w:val="single" w:sz="4" w:color="FFFFFF"/>
+            </w:tcBorders>
+          </w:tcPr>
+          <w:p>
+            <w:pPr>
+              <w:spacing w:before="120" w:after="120" w:line="259" w:lineRule="auto"/>
+              <w:jc w:val="center"/>
+            </w:pPr>
+            <w:r/>
+            <w:r>
+              <w:rPr>
+                <w:rFonts w:ascii="Calibri" w:hAnsi="Calibri" w:eastAsia="Calibri"/>
+                <w:b/>
+                <w:i w:val="0"/>
+                <w:color w:val="FFFFFF"/>
+                <w:sz w:val="28"/>
+              </w:rPr>
+              <w:t>1</w:t>
+            </w:r>
+          </w:p>
+        </w:tc>
+        <w:tc>
+          <w:tcPr>
+            <w:tcW w:type="dxa" w:w="5156"/>
+            <w:shd w:fill="E7F0F7" w:val="clear"/>
+            <w:tcBorders>
+              <w:top w:val="single" w:sz="4" w:color="E7F0F7"/>
+              <w:left w:val="single" w:sz="4" w:color="E7F0F7"/>
+              <w:bottom w:val="single" w:sz="4" w:color="E7F0F7"/>
+              <w:right w:val="single" w:sz="4" w:color="E7F0F7"/>
+            </w:tcBorders>
+          </w:tcPr>
+          <w:p>
+            <w:pPr>
+              <w:spacing w:before="120" w:after="120" w:line="259" w:lineRule="auto"/>
+              <w:jc w:val="left"/>
+            </w:pPr>
+            <w:r/>
+            <w:r>
+              <w:rPr>
+                <w:rFonts w:ascii="Calibri" w:hAnsi="Calibri" w:eastAsia="Calibri"/>
+                <w:b w:val="0"/>
+                <w:i w:val="0"/>
+                <w:color w:val="1F2933"/>
+                <w:sz w:val="24"/>
+              </w:rPr>
+              <w:t>Porcentaje de gente exitosa que tiene redes sociales</w:t>
+            </w:r>
+          </w:p>
+        </w:tc>
+      </w:tr>
+      <w:tr>
+        <w:trPr>
+          <w:cantSplit/>
+        </w:trPr>
+        <w:tc>
+          <w:tcPr>
+            <w:tcW w:type="dxa" w:w="5156"/>
+            <w:shd w:fill="2E75B6" w:val="clear"/>
+            <w:tcBorders>
+              <w:top w:val="single" w:sz="4" w:color="FFFFFF"/>
+              <w:left w:val="single" w:sz="4" w:color="FFFFFF"/>
+              <w:bottom w:val="single" w:sz="4" w:color="FFFFFF"/>
+              <w:right w:val="single" w:sz="4" w:color="FFFFFF"/>
+            </w:tcBorders>
+          </w:tcPr>
+          <w:p>
+            <w:pPr>
+              <w:spacing w:before="120" w:after="120" w:line="259" w:lineRule="auto"/>
+              <w:jc w:val="center"/>
+            </w:pPr>
+            <w:r/>
+            <w:r>
+              <w:rPr>
+                <w:rFonts w:ascii="Calibri" w:hAnsi="Calibri" w:eastAsia="Calibri"/>
+                <w:b/>
+                <w:i w:val="0"/>
+                <w:color w:val="FFFFFF"/>
+                <w:sz w:val="28"/>
+              </w:rPr>
+              <w:t>2</w:t>
+            </w:r>
+          </w:p>
+        </w:tc>
+        <w:tc>
+          <w:tcPr>
+            <w:tcW w:type="dxa" w:w="5156"/>
+            <w:shd w:fill="FFFFFF" w:val="clear"/>
+            <w:tcBorders>
+              <w:top w:val="single" w:sz="4" w:color="E7F0F7"/>
+              <w:left w:val="single" w:sz="4" w:color="E7F0F7"/>
+              <w:bottom w:val="single" w:sz="4" w:color="E7F0F7"/>
+              <w:right w:val="single" w:sz="4" w:color="E7F0F7"/>
+            </w:tcBorders>
+          </w:tcPr>
+          <w:p>
+            <w:pPr>
+              <w:spacing w:before="120" w:after="120" w:line="259" w:lineRule="auto"/>
+              <w:jc w:val="left"/>
+            </w:pPr>
+            <w:r/>
+            <w:r>
+              <w:rPr>
+                <w:rFonts w:ascii="Calibri" w:hAnsi="Calibri" w:eastAsia="Calibri"/>
+                <w:b w:val="0"/>
+                <w:i w:val="0"/>
+                <w:color w:val="1F2933"/>
+                <w:sz w:val="24"/>
+              </w:rPr>
+              <w:t>Porcentaje de gente no exitosa que tiene redes sociales</w:t>
+            </w:r>
+          </w:p>
+        </w:tc>
+      </w:tr>
+      <w:tr>
+        <w:trPr>
+          <w:cantSplit/>
+        </w:trPr>
+        <w:tc>
+          <w:tcPr>
+            <w:tcW w:type="dxa" w:w="5156"/>
+            <w:shd w:fill="1F4E79" w:val="clear"/>
+            <w:tcBorders>
+              <w:top w:val="single" w:sz="4" w:color="FFFFFF"/>
+              <w:left w:val="single" w:sz="4" w:color="FFFFFF"/>
+              <w:bottom w:val="single" w:sz="4" w:color="FFFFFF"/>
+              <w:right w:val="single" w:sz="4" w:color="FFFFFF"/>
+            </w:tcBorders>
+          </w:tcPr>
+          <w:p>
+            <w:pPr>
+              <w:spacing w:before="120" w:after="120" w:line="259" w:lineRule="auto"/>
+              <w:jc w:val="center"/>
+            </w:pPr>
+            <w:r/>
+            <w:r>
+              <w:rPr>
+                <w:rFonts w:ascii="Calibri" w:hAnsi="Calibri" w:eastAsia="Calibri"/>
+                <w:b/>
+                <w:i w:val="0"/>
+                <w:color w:val="FFFFFF"/>
+                <w:sz w:val="28"/>
+              </w:rPr>
+              <w:t>3</w:t>
+            </w:r>
+          </w:p>
+        </w:tc>
+        <w:tc>
+          <w:tcPr>
+            <w:tcW w:type="dxa" w:w="5156"/>
+            <w:shd w:fill="E7F0F7" w:val="clear"/>
+            <w:tcBorders>
+              <w:top w:val="single" w:sz="4" w:color="E7F0F7"/>
+              <w:left w:val="single" w:sz="4" w:color="E7F0F7"/>
+              <w:bottom w:val="single" w:sz="4" w:color="E7F0F7"/>
+              <w:right w:val="single" w:sz="4" w:color="E7F0F7"/>
+            </w:tcBorders>
+          </w:tcPr>
+          <w:p>
+            <w:pPr>
+              <w:spacing w:before="120" w:after="120" w:line="259" w:lineRule="auto"/>
+              <w:jc w:val="left"/>
+            </w:pPr>
+            <w:r/>
+            <w:r>
+              <w:rPr>
+                <w:rFonts w:ascii="Calibri" w:hAnsi="Calibri" w:eastAsia="Calibri"/>
+                <w:b w:val="0"/>
+                <w:i w:val="0"/>
+                <w:color w:val="1F2933"/>
+                <w:sz w:val="24"/>
+              </w:rPr>
+              <w:t>Denuncias y casos en los que la gente se obsesiona con las redes sociales</w:t>
+            </w:r>
+          </w:p>
+        </w:tc>
+      </w:tr>
+      <w:tr>
+        <w:trPr>
+          <w:cantSplit/>
+        </w:trPr>
+        <w:tc>
+          <w:tcPr>
+            <w:tcW w:type="dxa" w:w="5156"/>
+            <w:shd w:fill="2E75B6" w:val="clear"/>
+            <w:tcBorders>
+              <w:top w:val="single" w:sz="4" w:color="FFFFFF"/>
+              <w:left w:val="single" w:sz="4" w:color="FFFFFF"/>
+              <w:bottom w:val="single" w:sz="4" w:color="FFFFFF"/>
+              <w:right w:val="single" w:sz="4" w:color="FFFFFF"/>
+            </w:tcBorders>
+          </w:tcPr>
+          <w:p>
+            <w:pPr>
+              <w:spacing w:before="120" w:after="120" w:line="259" w:lineRule="auto"/>
+              <w:jc w:val="center"/>
+            </w:pPr>
+            <w:r/>
+            <w:r>
+              <w:rPr>
+                <w:rFonts w:ascii="Calibri" w:hAnsi="Calibri" w:eastAsia="Calibri"/>
+                <w:b/>
+                <w:i w:val="0"/>
+                <w:color w:val="FFFFFF"/>
+                <w:sz w:val="28"/>
+              </w:rPr>
+              <w:t>4</w:t>
+            </w:r>
+          </w:p>
+        </w:tc>
+        <w:tc>
+          <w:tcPr>
+            <w:tcW w:type="dxa" w:w="5156"/>
+            <w:shd w:fill="FFFFFF" w:val="clear"/>
+            <w:tcBorders>
+              <w:top w:val="single" w:sz="4" w:color="E7F0F7"/>
+              <w:left w:val="single" w:sz="4" w:color="E7F0F7"/>
+              <w:bottom w:val="single" w:sz="4" w:color="E7F0F7"/>
+              <w:right w:val="single" w:sz="4" w:color="E7F0F7"/>
+            </w:tcBorders>
+          </w:tcPr>
+          <w:p>
+            <w:pPr>
+              <w:spacing w:before="120" w:after="120" w:line="259" w:lineRule="auto"/>
+              <w:jc w:val="left"/>
+            </w:pPr>
+            <w:r/>
+            <w:r>
+              <w:rPr>
+                <w:rFonts w:ascii="Calibri" w:hAnsi="Calibri" w:eastAsia="Calibri"/>
+                <w:b w:val="0"/>
+                <w:i w:val="0"/>
+                <w:color w:val="1F2933"/>
+                <w:sz w:val="24"/>
+              </w:rPr>
+              <w:t>Anuncios y marketing</w:t>
+            </w:r>
+          </w:p>
+        </w:tc>
+      </w:tr>
+      <w:tr>
+        <w:trPr>
+          <w:cantSplit/>
+        </w:trPr>
+        <w:tc>
+          <w:tcPr>
+            <w:tcW w:type="dxa" w:w="5156"/>
+            <w:shd w:fill="1F4E79" w:val="clear"/>
+            <w:tcBorders>
+              <w:top w:val="single" w:sz="4" w:color="FFFFFF"/>
+              <w:left w:val="single" w:sz="4" w:color="FFFFFF"/>
+              <w:bottom w:val="single" w:sz="4" w:color="FFFFFF"/>
+              <w:right w:val="single" w:sz="4" w:color="FFFFFF"/>
+            </w:tcBorders>
+          </w:tcPr>
+          <w:p>
+            <w:pPr>
+              <w:spacing w:before="120" w:after="120" w:line="259" w:lineRule="auto"/>
+              <w:jc w:val="center"/>
+            </w:pPr>
+            <w:r/>
+            <w:r>
+              <w:rPr>
+                <w:rFonts w:ascii="Calibri" w:hAnsi="Calibri" w:eastAsia="Calibri"/>
+                <w:b/>
+                <w:i w:val="0"/>
+                <w:color w:val="FFFFFF"/>
+                <w:sz w:val="28"/>
+              </w:rPr>
+              <w:t>5</w:t>
+            </w:r>
+          </w:p>
+        </w:tc>
+        <w:tc>
+          <w:tcPr>
+            <w:tcW w:type="dxa" w:w="5156"/>
+            <w:shd w:fill="E7F0F7" w:val="clear"/>
+            <w:tcBorders>
+              <w:top w:val="single" w:sz="4" w:color="E7F0F7"/>
+              <w:left w:val="single" w:sz="4" w:color="E7F0F7"/>
+              <w:bottom w:val="single" w:sz="4" w:color="E7F0F7"/>
+              <w:right w:val="single" w:sz="4" w:color="E7F0F7"/>
+            </w:tcBorders>
+          </w:tcPr>
+          <w:p>
+            <w:pPr>
+              <w:spacing w:before="120" w:after="120" w:line="259" w:lineRule="auto"/>
+              <w:jc w:val="left"/>
+            </w:pPr>
+            <w:r/>
+            <w:r>
+              <w:rPr>
+                <w:rFonts w:ascii="Calibri" w:hAnsi="Calibri" w:eastAsia="Calibri"/>
+                <w:b w:val="0"/>
+                <w:i w:val="0"/>
+                <w:color w:val="1F2933"/>
+                <w:sz w:val="24"/>
+              </w:rPr>
+              <w:t>Tiempo promedio en el que la gente con redes sociales está en el teléfono</w:t>
+            </w:r>
+          </w:p>
+        </w:tc>
+      </w:tr>
+      <w:tr>
+        <w:trPr>
+          <w:cantSplit/>
+        </w:trPr>
+        <w:tc>
+          <w:tcPr>
+            <w:tcW w:type="dxa" w:w="5156"/>
+            <w:shd w:fill="2E75B6" w:val="clear"/>
+            <w:tcBorders>
+              <w:top w:val="single" w:sz="4" w:color="FFFFFF"/>
+              <w:left w:val="single" w:sz="4" w:color="FFFFFF"/>
+              <w:bottom w:val="single" w:sz="4" w:color="FFFFFF"/>
+              <w:right w:val="single" w:sz="4" w:color="FFFFFF"/>
+            </w:tcBorders>
+          </w:tcPr>
+          <w:p>
+            <w:pPr>
+              <w:spacing w:before="120" w:after="120" w:line="259" w:lineRule="auto"/>
+              <w:jc w:val="center"/>
+            </w:pPr>
+            <w:r/>
+            <w:r>
+              <w:rPr>
+                <w:rFonts w:ascii="Calibri" w:hAnsi="Calibri" w:eastAsia="Calibri"/>
+                <w:b/>
+                <w:i w:val="0"/>
+                <w:color w:val="FFFFFF"/>
+                <w:sz w:val="28"/>
+              </w:rPr>
+              <w:t>6</w:t>
+            </w:r>
+          </w:p>
+        </w:tc>
+        <w:tc>
+          <w:tcPr>
+            <w:tcW w:type="dxa" w:w="5156"/>
+            <w:shd w:fill="FFFFFF" w:val="clear"/>
+            <w:tcBorders>
+              <w:top w:val="single" w:sz="4" w:color="E7F0F7"/>
+              <w:left w:val="single" w:sz="4" w:color="E7F0F7"/>
+              <w:bottom w:val="single" w:sz="4" w:color="E7F0F7"/>
+              <w:right w:val="single" w:sz="4" w:color="E7F0F7"/>
+            </w:tcBorders>
+          </w:tcPr>
+          <w:p>
+            <w:pPr>
+              <w:spacing w:before="120" w:after="120" w:line="259" w:lineRule="auto"/>
+              <w:jc w:val="left"/>
+            </w:pPr>
+            <w:r/>
+            <w:r>
+              <w:rPr>
+                <w:rFonts w:ascii="Calibri" w:hAnsi="Calibri" w:eastAsia="Calibri"/>
+                <w:b w:val="0"/>
+                <w:i w:val="0"/>
+                <w:color w:val="1F2933"/>
+                <w:sz w:val="24"/>
+              </w:rPr>
+              <w:t>Búsquedas comunes entre gente exitosa y gente que no es exitosa</w:t>
+            </w:r>
+          </w:p>
+        </w:tc>
+      </w:tr>
+    </w:tbl>
     <w:p>
       <w:pPr>
-        <w:spacing w:before="40" w:after="40" w:line="276" w:lineRule="auto"/>
-        <w:ind w:left="425"/>
-      </w:pPr>
-      <w:r>
-        <w:rPr>
-          <w:rFonts w:ascii="Calibri" w:hAnsi="Calibri" w:eastAsia="Calibri"/>
-          <w:b w:val="0"/>
-          <w:i w:val="0"/>
-          <w:sz w:val="24"/>
-        </w:rPr>
-        <w:t>1. Porcentaje de gente exitosa que tiene redes sociales</w:t>
-      </w:r>
-    </w:p>
-    <w:p>
-      <w:pPr>
-        <w:spacing w:before="40" w:after="40" w:line="276" w:lineRule="auto"/>
-        <w:ind w:left="425"/>
-      </w:pPr>
-      <w:r>
-        <w:rPr>
-          <w:rFonts w:ascii="Calibri" w:hAnsi="Calibri" w:eastAsia="Calibri"/>
-          <w:b w:val="0"/>
-          <w:i w:val="0"/>
-          <w:sz w:val="24"/>
-        </w:rPr>
-        <w:t>2. Porcentaje de gente no exitosa que tiene redes sociales</w:t>
-      </w:r>
-    </w:p>
-    <w:p>
-      <w:pPr>
-        <w:spacing w:before="40" w:after="40" w:line="276" w:lineRule="auto"/>
-        <w:ind w:left="425"/>
-      </w:pPr>
-      <w:r>
-        <w:rPr>
-          <w:rFonts w:ascii="Calibri" w:hAnsi="Calibri" w:eastAsia="Calibri"/>
-          <w:b w:val="0"/>
-          <w:i w:val="0"/>
-          <w:sz w:val="24"/>
-        </w:rPr>
-        <w:t>3. Denuncias y casos en los que la gente se obsesiona con las redes sociales</w:t>
-      </w:r>
-    </w:p>
-    <w:p>
-      <w:pPr>
-        <w:spacing w:before="40" w:after="40" w:line="276" w:lineRule="auto"/>
-        <w:ind w:left="425"/>
-      </w:pPr>
-      <w:r>
-        <w:rPr>
-          <w:rFonts w:ascii="Calibri" w:hAnsi="Calibri" w:eastAsia="Calibri"/>
-          <w:b w:val="0"/>
-          <w:i w:val="0"/>
-          <w:sz w:val="24"/>
-        </w:rPr>
-        <w:t>4. Anuncios y marketing</w:t>
-      </w:r>
-    </w:p>
-    <w:p>
-      <w:pPr>
-        <w:spacing w:before="40" w:after="40" w:line="276" w:lineRule="auto"/>
-        <w:ind w:left="425"/>
-      </w:pPr>
-      <w:r>
-        <w:rPr>
-          <w:rFonts w:ascii="Calibri" w:hAnsi="Calibri" w:eastAsia="Calibri"/>
-          <w:b w:val="0"/>
-          <w:i w:val="0"/>
-          <w:sz w:val="24"/>
-        </w:rPr>
-        <w:t>5. Tiempo promedio en el que la gente con redes sociales está en el teléfono</w:t>
-      </w:r>
-    </w:p>
-    <w:p>
-      <w:pPr>
-        <w:spacing w:before="40" w:after="40" w:line="276" w:lineRule="auto"/>
-        <w:ind w:left="425"/>
-      </w:pPr>
-      <w:r>
-        <w:rPr>
-          <w:rFonts w:ascii="Calibri" w:hAnsi="Calibri" w:eastAsia="Calibri"/>
-          <w:b w:val="0"/>
-          <w:i w:val="0"/>
-          <w:sz w:val="24"/>
-        </w:rPr>
-        <w:t>6. Búsquedas comunes entre gente exitosa y gente que no es exitosa</w:t>
-      </w:r>
-    </w:p>
-    <w:p>
-      <w:pPr>
-        <w:spacing w:before="320" w:after="120" w:line="276" w:lineRule="auto"/>
-        <w:jc w:val="left"/>
+        <w:spacing w:before="320" w:after="160"/>
       </w:pPr>
       <w:r>
         <w:rPr>
           <w:rFonts w:ascii="Calibri" w:hAnsi="Calibri" w:eastAsia="Calibri"/>
           <w:b/>
           <w:i w:val="0"/>
-          <w:color w:val="1F4E79"/>
-          <w:sz w:val="26"/>
+          <w:color w:val="1B3A4B"/>
+          <w:sz w:val="32"/>
         </w:rPr>
         <w:t>¿Por qué es útil?</w:t>
       </w:r>
     </w:p>
-    <w:p>
-      <w:pPr>
-        <w:spacing w:before="40" w:after="120" w:line="276" w:lineRule="auto"/>
-        <w:jc w:val="left"/>
-      </w:pPr>
-      <w:r>
-        <w:rPr>
-          <w:rFonts w:ascii="Calibri" w:hAnsi="Calibri" w:eastAsia="Calibri"/>
-          <w:b w:val="0"/>
-          <w:i w:val="0"/>
-          <w:sz w:val="24"/>
-        </w:rPr>
-        <w:t>Nos permite saber si las redes sociales son realmente útiles o solo son un distractor para nosotros y si nos llega a impactar de forma negativa en nuestra vida.</w:t>
-      </w:r>
-    </w:p>
+    <w:tbl>
+      <w:tblPr>
+        <w:tblW w:type="auto" w:w="0"/>
+        <w:tblLayout w:type="fixed"/>
+        <w:tblLook w:firstColumn="1" w:firstRow="1" w:lastColumn="0" w:lastRow="0" w:noHBand="0" w:noVBand="1" w:val="04A0"/>
+      </w:tblPr>
+      <w:tblGrid>
+        <w:gridCol w:w="10318"/>
+      </w:tblGrid>
+      <w:tr>
+        <w:tc>
+          <w:tcPr>
+            <w:tcW w:type="dxa" w:w="10312"/>
+            <w:shd w:fill="FFF6E8" w:val="clear"/>
+            <w:tcBorders>
+              <w:top w:val="single" w:sz="12" w:color="E08A1E"/>
+              <w:left w:val="single" w:sz="12" w:color="E08A1E"/>
+              <w:bottom w:val="single" w:sz="12" w:color="E08A1E"/>
+              <w:right w:val="single" w:sz="12" w:color="E08A1E"/>
+            </w:tcBorders>
+          </w:tcPr>
+          <w:p>
+            <w:pPr>
+              <w:spacing w:before="160" w:after="160" w:line="259" w:lineRule="auto"/>
+              <w:jc w:val="left"/>
+            </w:pPr>
+            <w:r/>
+            <w:r>
+              <w:rPr>
+                <w:rFonts w:ascii="Calibri" w:hAnsi="Calibri" w:eastAsia="Calibri"/>
+                <w:b w:val="0"/>
+                <w:i w:val="0"/>
+                <w:color w:val="1F2933"/>
+                <w:sz w:val="24"/>
+              </w:rPr>
+              <w:t>Nos permite saber si las redes sociales son realmente útiles o solo son un distractor para nosotros y si nos llega a impactar de forma negativa en nuestra vida.</w:t>
+            </w:r>
+          </w:p>
+        </w:tc>
+      </w:tr>
+    </w:tbl>
     <w:sectPr>
       <w:pgSz w:w="12240" w:h="15840"/>
-      <w:pgMar w:top="1247" w:right="1361" w:bottom="1247" w:left="1361" w:header="720" w:footer="720" w:gutter="0"/>
+      <w:pgMar w:top="907" w:right="964" w:bottom="907" w:left="964" w:header="720" w:footer="720" w:gutter="0"/>
       <w:cols w:space="720"/>
       <w:docGrid w:linePitch="360"/>
     </w:sectPr>

</xml_diff>